<commit_message>
docs: update project report to v3 and fix README encoding
KrestivOS_Project_Report.docx:
- Renamed KrestivOS -> KreativOS throughout
- Version bumped to 3.0
- All 10 roadmap phases marked as Completed
- Added Version 3.0 achievements section with 17 bullet points
  covering all shipped features (pipeline, memory, web search,
  app builder, canvas, voice, code review, scheduler, auth, PWA,
  telegram bot, office suite, audit log, pipeline view, etc.)

README.md:
- Rewritten as clean UTF-8 (was garbled Latin-1 mojibake)
- Updated for v3: new feature table, correct port (8000),
  Windows dev instructions, full tech stack table
</commit_message>
<xml_diff>
--- a/KrestivOS_Project_Report.docx
+++ b/KrestivOS_Project_Report.docx
@@ -12,7 +12,7 @@
           <w:color w:val="4F3FA0"/>
           <w:sz w:val="64"/>
         </w:rPr>
-        <w:t>🧠 KrestivOS</w:t>
+        <w:t>🧠 KreativOS</w:t>
       </w:r>
     </w:p>
     <w:p>
@@ -36,7 +36,7 @@
           <w:color w:val="8C8CA0"/>
           <w:sz w:val="22"/>
         </w:rPr>
-        <w:t>Version 2.1  ·  June 2026</w:t>
+        <w:t>Version 3.0  ·  June 2026</w:t>
       </w:r>
     </w:p>
     <w:p/>
@@ -71,7 +71,7 @@
           <w:b w:val="0"/>
           <w:sz w:val="22"/>
         </w:rPr>
-        <w:t>KrestivOS is a self-hosted, browser-based Agentic Operating System that runs 100% locally on a CPU-only Oracle Cloud VM using Ollama and free open-source AI models. The goal is to give a non-technical user the full power of a multi-agent AI workspace — like Claude Desktop or OpenCode — accessible from any browser on any device, with no cloud API costs, no subscriptions, and no technical setup beyond one command.</w:t>
+        <w:t>KreativOS is a self-hosted, browser-based Agentic Operating System that runs 100% locally on a CPU-only Oracle Cloud VM using Ollama and free open-source AI models. The goal is to give a non-technical user the full power of a multi-agent AI workspace — like Claude Desktop or OpenCode — accessible from any browser on any device, with no cloud API costs, no subscriptions, and no technical setup beyond one command.</w:t>
       </w:r>
     </w:p>
     <w:p/>
@@ -171,7 +171,7 @@
           <w:b w:val="0"/>
           <w:sz w:val="22"/>
         </w:rPr>
-        <w:t>Three existing systems were analysed before building KrestivOS:</w:t>
+        <w:t>Three existing systems were analysed before building KreativOS:</w:t>
       </w:r>
     </w:p>
     <w:tbl>
@@ -469,7 +469,7 @@
           <w:color w:val="4F3FA0"/>
           <w:sz w:val="48"/>
         </w:rPr>
-        <w:t>3. Achievements (v1 → v2 → v2.1)</w:t>
+        <w:t>3. Achievements (v1 → v2 → v3)</w:t>
       </w:r>
     </w:p>
     <w:p>
@@ -719,7 +719,7 @@
           <w:color w:val="3C3C50"/>
           <w:sz w:val="36"/>
         </w:rPr>
-        <w:t>Version 2.1 (current)</w:t>
+        <w:t>Version 3.0 (current)</w:t>
       </w:r>
     </w:p>
     <w:p>
@@ -732,7 +732,7 @@
         <w:rPr>
           <w:sz w:val="21"/>
         </w:rPr>
-        <w:t>Model Hub — HuggingFace GGUF model browser inside KrestivOS</w:t>
+        <w:t>Model Hub — HuggingFace GGUF model browser inside KreativOS</w:t>
       </w:r>
     </w:p>
     <w:p>
@@ -798,6 +798,153 @@
           <w:sz w:val="21"/>
         </w:rPr>
         <w:t>CPU guidance — file size and RAM warnings for Oracle VM users</w:t>
+      </w:r>
+    </w:p>
+    <w:p>
+      <w:pPr>
+        <w:pStyle w:val="Normal"/>
+      </w:pPr>
+      <w:r>
+        <w:rPr>
+          <w:b/>
+        </w:rPr>
+        <w:t>Version 3.0</w:t>
+      </w:r>
+    </w:p>
+    <w:p>
+      <w:pPr>
+        <w:pStyle w:val="List Bullet"/>
+      </w:pPr>
+      <w:r>
+        <w:t xml:space="preserve">All 10 enhancement phases shipped in a single unified codebase</w:t>
+      </w:r>
+    </w:p>
+    <w:p>
+      <w:pPr>
+        <w:pStyle w:val="List Bullet"/>
+      </w:pPr>
+      <w:r>
+        <w:t xml:space="preserve">Multi-Agent Pipeline - Orchestrator auto-routes tasks across Architect &gt; Coder &gt; DevOps agents</w:t>
+      </w:r>
+    </w:p>
+    <w:p>
+      <w:pPr>
+        <w:pStyle w:val="List Bullet"/>
+      </w:pPr>
+      <w:r>
+        <w:t xml:space="preserve">Project Memory - persistent context file per project; agents read memory before responding</w:t>
+      </w:r>
+    </w:p>
+    <w:p>
+      <w:pPr>
+        <w:pStyle w:val="List Bullet"/>
+      </w:pPr>
+      <w:r>
+        <w:t xml:space="preserve">Web Search - Researcher agent uses DuckDuckGo live search; results injected into context</w:t>
+      </w:r>
+    </w:p>
+    <w:p>
+      <w:pPr>
+        <w:pStyle w:val="List Bullet"/>
+      </w:pPr>
+      <w:r>
+        <w:t xml:space="preserve">App Builder - Coder generates full multi-file apps with preview panel and zip download</w:t>
+      </w:r>
+    </w:p>
+    <w:p>
+      <w:pPr>
+        <w:pStyle w:val="List Bullet"/>
+      </w:pPr>
+      <w:r>
+        <w:t xml:space="preserve">Visual Canvas - drag-and-drop node editor for custom multi-agent workflows</w:t>
+      </w:r>
+    </w:p>
+    <w:p>
+      <w:pPr>
+        <w:pStyle w:val="List Bullet"/>
+      </w:pPr>
+      <w:r>
+        <w:t xml:space="preserve">Voice Output - browser TTS speaks agent responses; full voice conversation mode</w:t>
+      </w:r>
+    </w:p>
+    <w:p>
+      <w:pPr>
+        <w:pStyle w:val="List Bullet"/>
+      </w:pPr>
+      <w:r>
+        <w:t xml:space="preserve">Code Review Agent - upload any file, get structured bug/security/style report with auto-fix</w:t>
+      </w:r>
+    </w:p>
+    <w:p>
+      <w:pPr>
+        <w:pStyle w:val="List Bullet"/>
+      </w:pPr>
+      <w:r>
+        <w:t xml:space="preserve">Scheduled Tasks - cron-style task scheduler with Dashboard visibility and output logs</w:t>
+      </w:r>
+    </w:p>
+    <w:p>
+      <w:pPr>
+        <w:pStyle w:val="List Bullet"/>
+      </w:pPr>
+      <w:r>
+        <w:t xml:space="preserve">Multi-User Auth - login page, per-user workspaces, admin panel</w:t>
+      </w:r>
+    </w:p>
+    <w:p>
+      <w:pPr>
+        <w:pStyle w:val="List Bullet"/>
+      </w:pPr>
+      <w:r>
+        <w:t xml:space="preserve">PWA - installable on mobile, offline chat history, push notifications, mobile-optimised layout</w:t>
+      </w:r>
+    </w:p>
+    <w:p>
+      <w:pPr>
+        <w:pStyle w:val="List Bullet"/>
+      </w:pPr>
+      <w:r>
+        <w:t xml:space="preserve">Telegram Bot - control KreativOS from Telegram: run tasks, get results, check status</w:t>
+      </w:r>
+    </w:p>
+    <w:p>
+      <w:pPr>
+        <w:pStyle w:val="List Bullet"/>
+      </w:pPr>
+      <w:r>
+        <w:t xml:space="preserve">Office Suite - generate .docx, .xlsx, .pptx files directly from agent output</w:t>
+      </w:r>
+    </w:p>
+    <w:p>
+      <w:pPr>
+        <w:pStyle w:val="List Bullet"/>
+      </w:pPr>
+      <w:r>
+        <w:t xml:space="preserve">Audit Log - timestamped log of every agent action with full context</w:t>
+      </w:r>
+    </w:p>
+    <w:p>
+      <w:pPr>
+        <w:pStyle w:val="List Bullet"/>
+      </w:pPr>
+      <w:r>
+        <w:t xml:space="preserve">Pipeline View - real-time multi-agent task pipeline with stage-by-stage progress tracker</w:t>
+      </w:r>
+    </w:p>
+    <w:p>
+      <w:pPr>
+        <w:pStyle w:val="List Bullet"/>
+      </w:pPr>
+      <w:r>
+        <w:t xml:space="preserve">Scheduler View - visual cron manager with next-run countdown and task history</w:t>
+      </w:r>
+    </w:p>
+    <w:p>
+      <w:pPr>
+        <w:pStyle w:val="List Bullet"/>
+      </w:pPr>
+      <w:r>
+        <w:t xml:space="preserve">Skill Evaluator - benchmark agent quality across domain-specific test prompts</w:t>
       </w:r>
     </w:p>
     <w:p>
@@ -2799,7 +2946,7 @@
         <w:rPr>
           <w:sz w:val="21"/>
         </w:rPr>
-        <w:t>KrestivOS becomes installable as a Progressive Web App on phone</w:t>
+        <w:t>KreativOS becomes installable as a Progressive Web App on phone</w:t>
       </w:r>
     </w:p>
     <w:p>
@@ -2914,9 +3061,9 @@
           <w:color w:val="28283C"/>
           <w:sz w:val="19"/>
         </w:rPr>
-        <w:t>git clone https://github.com/mits1987/KrestivOS.git</w:t>
+        <w:t>git clone https://github.com/mits1987/KreativOS.git</w:t>
         <w:br/>
-        <w:t>cd KrestivOS</w:t>
+        <w:t>cd KreativOS</w:t>
       </w:r>
     </w:p>
     <w:p>
@@ -3071,7 +3218,7 @@
           <w:color w:val="A0A0B4"/>
           <w:sz w:val="18"/>
         </w:rPr>
-        <w:t>KrestivOS v2.1  ·  Built with Claude  ·  26 June 2026</w:t>
+        <w:t>KreativOS v3.0  ·  Built with Claude  ·  26 June 2026</w:t>
       </w:r>
     </w:p>
     <w:sectPr>

</xml_diff>